<commit_message>
docs(busyness): doc + BACKLOG bij naar kans-per-dag + dagen-tempo
Co-Authored-By: Claude Opus 4.8 <noreply@anthropic.com>
</commit_message>
<xml_diff>
--- a/docs/rustige-momenten-detectie.docx
+++ b/docs/rustige-momenten-detectie.docx
@@ -3675,10 +3675,30 @@
           <w:b/>
           <w:bCs/>
         </w:rPr>
-        <w:t xml:space="preserve">3. Tempo als plafond (instelbaar). </w:t>
-      </w:r>
-      <w:r>
-        <w:t xml:space="preserve">Hoeveel momenten Filly maximaal per week aandraagt.</w:t>
+        <w:t xml:space="preserve">3. Aaneengesloten dagdelen = één kans. </w:t>
+      </w:r>
+      <w:r>
+        <w:t xml:space="preserve">Zijn op één dag opeenvolgende dagdelen rustig (bv. diner én avond), dan tellen die samen als één kans, met een venster dat het hele blok beslaat (bv. 17:00–23:00). Zo snoept één drukke clustering niet je hele tempo op.</w:t>
+      </w:r>
+    </w:p>
+    <w:p>
+      <w:pPr>
+        <w:pStyle w:val="ListParagraph"/>
+        <w:numPr>
+          <w:ilvl w:val="0"/>
+          <w:numId w:val="2"/>
+        </w:numPr>
+        <w:spacing w:after="60"/>
+      </w:pPr>
+      <w:r>
+        <w:rPr>
+          <w:b/>
+          <w:bCs/>
+        </w:rPr>
+        <w:t xml:space="preserve">4. Tempo als plafond (instelbaar). </w:t>
+      </w:r>
+      <w:r>
+        <w:t xml:space="preserve">Hoeveel rustige DAGEN Filly maximaal per week aandraagt (max één kans per dag). Een rustige week levert er minder op; het plafond wordt nooit opgevuld met dagen die eigenlijk niet rustig zijn.</w:t>
       </w:r>
     </w:p>
     <w:p>
@@ -3686,7 +3706,7 @@
         <w:spacing w:after="120"/>
       </w:pPr>
       <w:r>
-        <w:t xml:space="preserve">Toegepast op de voorbeeldweek. Dagdelen met afwijking onder −2,7 én genoeg gat:</w:t>
+        <w:t xml:space="preserve">Toegepast op de voorbeeldweek. Elke rij is een kans (een dag met afwijking onder −2,7 én genoeg gat):</w:t>
       </w:r>
     </w:p>
     <w:tbl>
@@ -3731,7 +3751,7 @@
                 <w:sz w:val="20"/>
                 <w:szCs w:val="20"/>
               </w:rPr>
-              <w:t xml:space="preserve">Moment</w:t>
+              <w:t xml:space="preserve">Kans (dag)</w:t>
             </w:r>
           </w:p>
         </w:tc>
@@ -3831,7 +3851,7 @@
                 <w:sz w:val="20"/>
                 <w:szCs w:val="20"/>
               </w:rPr>
-              <w:t xml:space="preserve">donderdag-middag</w:t>
+              <w:t xml:space="preserve">donderdag (middag)</w:t>
             </w:r>
           </w:p>
         </w:tc>
@@ -3936,7 +3956,7 @@
                 <w:sz w:val="20"/>
                 <w:szCs w:val="20"/>
               </w:rPr>
-              <w:t xml:space="preserve">maandag-diner</w:t>
+              <w:t xml:space="preserve">maandag (diner)</w:t>
             </w:r>
           </w:p>
         </w:tc>
@@ -4038,7 +4058,7 @@
                 <w:sz w:val="20"/>
                 <w:szCs w:val="20"/>
               </w:rPr>
-              <w:t xml:space="preserve">zaterdag-lunch</w:t>
+              <w:t xml:space="preserve">zaterdag (lunch)</w:t>
             </w:r>
           </w:p>
         </w:tc>
@@ -4140,7 +4160,7 @@
                 <w:sz w:val="20"/>
                 <w:szCs w:val="20"/>
               </w:rPr>
-              <w:t xml:space="preserve">woensdag-avond</w:t>
+              <w:t xml:space="preserve">woensdag (avond)</w:t>
             </w:r>
           </w:p>
         </w:tc>
@@ -4235,10 +4255,10 @@
           <w:b/>
           <w:bCs/>
         </w:rPr>
-        <w:t xml:space="preserve">Het tempo kiest daarna: </w:t>
-      </w:r>
-      <w:r>
-        <w:t xml:space="preserve">bij tempo 2 toont Filly de 2 sterkste (donderdag-middag + maandag-diner); bij tempo 1 alleen donderdag-middag. Een week zonder momenten onder −2,7 levert niks op, we vullen het plafond nooit op met momenten die eigenlijk niet rustig zijn.</w:t>
+        <w:t xml:space="preserve">Het tempo kiest daarna op dagniveau: </w:t>
+      </w:r>
+      <w:r>
+        <w:t xml:space="preserve">bij tempo 2 toont Filly de 2 sterkste dagen (donderdag + maandag); bij tempo 1 alleen donderdag. Zou op donderdag óók de avond rustig zijn geweest, dan was dat samen één kans (“donderdag middag en avond”), nog steeds één dag.</w:t>
       </w:r>
     </w:p>
     <w:p>
@@ -4786,7 +4806,7 @@
         <w:t xml:space="preserve">Tempo (per zaak, instelbaar): </w:t>
       </w:r>
       <w:r>
-        <w:t xml:space="preserve">quiet_moments_per_week, default 2, bereik 1–6. Op de account-pagina.</w:t>
+        <w:t xml:space="preserve">quiet_moments_per_week = max aantal rustige DAGEN per week, default 2, bereik 1–6. Op de account-pagina (Algemeen → Meldingen).</w:t>
       </w:r>
     </w:p>
     <w:p>

</xml_diff>